<commit_message>
kien truc thu muc du an
</commit_message>
<xml_diff>
--- a/Doc/OnTap/5_Verilog_SRAM.docx
+++ b/Doc/OnTap/5_Verilog_SRAM.docx
@@ -14355,8 +14355,8 @@
       <w:bCs/>
     </w:rPr>
   </w:style>
-  <w:style w:type="character" w:styleId="Bulletsuser">
-    <w:name w:val="Bullets (user)"/>
+  <w:style w:type="character" w:styleId="Bullets">
+    <w:name w:val="Bullets"/>
     <w:qFormat/>
     <w:rPr>
       <w:rFonts w:ascii="OpenSymbol" w:hAnsi="OpenSymbol" w:eastAsia="OpenSymbol" w:cs="OpenSymbol"/>

</xml_diff>